<commit_message>
Fase 2: actualiza el Informe de Avance (genomas de fagos descargados)
Actividad 3.1: se descargaron los 200 genomas FASTA de los fagos desde NCBI. Se ajustan el estado de los objetivos, el plan de trabajo y las actividades retrasadas.

Co-Authored-By: Claude Sonnet 5.5 <noreply@anthropic.com>
</commit_message>
<xml_diff>
--- a/Fase 2/2.4_APT122_InformeAvance_JohaoRamirez.docx
+++ b/Fase 2/2.4_APT122_InformeAvance_JohaoRamirez.docx
@@ -375,8 +375,8 @@
       <w:tblGrid>
         <w:gridCol w:w="1423"/>
         <w:gridCol w:w="1232"/>
-        <w:gridCol w:w="3250"/>
-        <w:gridCol w:w="3455"/>
+        <w:gridCol w:w="3350"/>
+        <w:gridCol w:w="3355"/>
       </w:tblGrid>
       <w:tr>
         <w:trPr>
@@ -408,7 +408,7 @@
         </w:tc>
         <w:tc>
           <w:tcPr>
-            <w:tcW w:w="3250" w:type="dxa"/>
+            <w:tcW w:w="3350" w:type="dxa"/>
             <w:shd w:val="clear" w:color="auto" w:fill="F2F2F2"/>
           </w:tcPr>
           <w:p>
@@ -420,7 +420,7 @@
         </w:tc>
         <w:tc>
           <w:tcPr>
-            <w:tcW w:w="3455" w:type="dxa"/>
+            <w:tcW w:w="3355" w:type="dxa"/>
             <w:shd w:val="clear" w:color="auto" w:fill="F2F2F2"/>
           </w:tcPr>
           <w:p>
@@ -456,7 +456,7 @@
         </w:tc>
         <w:tc>
           <w:tcPr>
-            <w:tcW w:w="3250" w:type="dxa"/>
+            <w:tcW w:w="3350" w:type="dxa"/>
           </w:tcPr>
           <w:p>
             <w:pPr/>
@@ -467,7 +467,7 @@
         </w:tc>
         <w:tc>
           <w:tcPr>
-            <w:tcW w:w="3455" w:type="dxa"/>
+            <w:tcW w:w="3355" w:type="dxa"/>
           </w:tcPr>
           <w:p>
             <w:pPr/>
@@ -502,7 +502,7 @@
         </w:tc>
         <w:tc>
           <w:tcPr>
-            <w:tcW w:w="3250" w:type="dxa"/>
+            <w:tcW w:w="3350" w:type="dxa"/>
           </w:tcPr>
           <w:p>
             <w:pPr/>
@@ -513,12 +513,12 @@
         </w:tc>
         <w:tc>
           <w:tcPr>
-            <w:tcW w:w="3455" w:type="dxa"/>
-          </w:tcPr>
-          <w:p>
-            <w:pPr/>
-            <w:r>
-              <w:t xml:space="preserve">Detectar proteínas de unión al receptor y calcular embeddings, descargar los genomas de los fagos, curaduría y las fuentes PhageScope y </w:t>
+            <w:tcW w:w="3355" w:type="dxa"/>
+          </w:tcPr>
+          <w:p>
+            <w:pPr/>
+            <w:r>
+              <w:t xml:space="preserve">Detectar proteínas de unión al receptor y calcular embeddings, curaduría y las fuentes PhageScope y </w:t>
             </w:r>
             <w:r>
               <w:rPr>
@@ -554,7 +554,7 @@
         </w:tc>
         <w:tc>
           <w:tcPr>
-            <w:tcW w:w="3250" w:type="dxa"/>
+            <w:tcW w:w="3350" w:type="dxa"/>
           </w:tcPr>
           <w:p>
             <w:pPr/>
@@ -565,7 +565,7 @@
         </w:tc>
         <w:tc>
           <w:tcPr>
-            <w:tcW w:w="3455" w:type="dxa"/>
+            <w:tcW w:w="3355" w:type="dxa"/>
           </w:tcPr>
           <w:p>
             <w:pPr/>
@@ -600,7 +600,7 @@
         </w:tc>
         <w:tc>
           <w:tcPr>
-            <w:tcW w:w="3250" w:type="dxa"/>
+            <w:tcW w:w="3350" w:type="dxa"/>
           </w:tcPr>
           <w:p>
             <w:pPr/>
@@ -611,7 +611,7 @@
         </w:tc>
         <w:tc>
           <w:tcPr>
-            <w:tcW w:w="3455" w:type="dxa"/>
+            <w:tcW w:w="3355" w:type="dxa"/>
           </w:tcPr>
           <w:p>
             <w:pPr/>
@@ -646,7 +646,7 @@
         </w:tc>
         <w:tc>
           <w:tcPr>
-            <w:tcW w:w="3250" w:type="dxa"/>
+            <w:tcW w:w="3350" w:type="dxa"/>
           </w:tcPr>
           <w:p>
             <w:pPr/>
@@ -657,7 +657,7 @@
         </w:tc>
         <w:tc>
           <w:tcPr>
-            <w:tcW w:w="3455" w:type="dxa"/>
+            <w:tcW w:w="3355" w:type="dxa"/>
           </w:tcPr>
           <w:p>
             <w:pPr/>
@@ -2758,7 +2758,7 @@
           <w:p>
             <w:pPr/>
             <w:r>
-              <w:t xml:space="preserve">Se cargó la tabla de metadatos de INPHARED (200 fagos). Faltan los genomas FASTA y las fuentes PhageScope y </w:t>
+              <w:t xml:space="preserve">Se cargó la tabla de metadatos de INPHARED (200 fagos). Se descargaron además los 200 genomas FASTA desde NCBI (5,5 MB comprimidos). Faltan las fuentes PhageScope y </w:t>
             </w:r>
             <w:r>
               <w:rPr>
@@ -4234,8 +4234,8 @@
       </w:tblPr>
       <w:tblGrid>
         <w:gridCol w:w="1423"/>
-        <w:gridCol w:w="2808"/>
-        <w:gridCol w:w="3903"/>
+        <w:gridCol w:w="2922"/>
+        <w:gridCol w:w="3789"/>
         <w:gridCol w:w="1226"/>
       </w:tblGrid>
       <w:tr>
@@ -4256,7 +4256,7 @@
         </w:tc>
         <w:tc>
           <w:tcPr>
-            <w:tcW w:w="2808" w:type="dxa"/>
+            <w:tcW w:w="2922" w:type="dxa"/>
             <w:shd w:val="clear" w:color="auto" w:fill="F2F2F2"/>
           </w:tcPr>
           <w:p>
@@ -4268,7 +4268,7 @@
         </w:tc>
         <w:tc>
           <w:tcPr>
-            <w:tcW w:w="3903" w:type="dxa"/>
+            <w:tcW w:w="3789" w:type="dxa"/>
             <w:shd w:val="clear" w:color="auto" w:fill="F2F2F2"/>
           </w:tcPr>
           <w:p>
@@ -4305,7 +4305,7 @@
         </w:tc>
         <w:tc>
           <w:tcPr>
-            <w:tcW w:w="2808" w:type="dxa"/>
+            <w:tcW w:w="2922" w:type="dxa"/>
           </w:tcPr>
           <w:p>
             <w:pPr/>
@@ -4316,7 +4316,7 @@
         </w:tc>
         <w:tc>
           <w:tcPr>
-            <w:tcW w:w="3903" w:type="dxa"/>
+            <w:tcW w:w="3789" w:type="dxa"/>
           </w:tcPr>
           <w:p>
             <w:pPr/>
@@ -4351,7 +4351,7 @@
         </w:tc>
         <w:tc>
           <w:tcPr>
-            <w:tcW w:w="2808" w:type="dxa"/>
+            <w:tcW w:w="2922" w:type="dxa"/>
           </w:tcPr>
           <w:p>
             <w:pPr/>
@@ -4362,7 +4362,7 @@
         </w:tc>
         <w:tc>
           <w:tcPr>
-            <w:tcW w:w="3903" w:type="dxa"/>
+            <w:tcW w:w="3789" w:type="dxa"/>
           </w:tcPr>
           <w:p>
             <w:pPr/>
@@ -4391,13 +4391,13 @@
           <w:p>
             <w:pPr/>
             <w:r>
-              <w:t xml:space="preserve">3.1 Genomas FASTA de los fagos y otras fuentes</w:t>
-            </w:r>
-          </w:p>
-        </w:tc>
-        <w:tc>
-          <w:tcPr>
-            <w:tcW w:w="2808" w:type="dxa"/>
+              <w:t xml:space="preserve">3.1 Otras fuentes de datos de fagos</w:t>
+            </w:r>
+          </w:p>
+        </w:tc>
+        <w:tc>
+          <w:tcPr>
+            <w:tcW w:w="2922" w:type="dxa"/>
           </w:tcPr>
           <w:p>
             <w:pPr/>
@@ -4408,12 +4408,12 @@
         </w:tc>
         <w:tc>
           <w:tcPr>
-            <w:tcW w:w="3903" w:type="dxa"/>
-          </w:tcPr>
-          <w:p>
-            <w:pPr/>
-            <w:r>
-              <w:t xml:space="preserve">Descargar por número de acceso los genomas de los 200 fagos y después sumar PhageScope y </w:t>
+            <w:tcW w:w="3789" w:type="dxa"/>
+          </w:tcPr>
+          <w:p>
+            <w:pPr/>
+            <w:r>
+              <w:t xml:space="preserve">Los genomas de los 200 fagos ya se bajaron de NCBI por número de acceso; falta sumar PhageScope y </w:t>
             </w:r>
             <w:r>
               <w:rPr>
@@ -4449,7 +4449,7 @@
         </w:tc>
         <w:tc>
           <w:tcPr>
-            <w:tcW w:w="2808" w:type="dxa"/>
+            <w:tcW w:w="2922" w:type="dxa"/>
           </w:tcPr>
           <w:p>
             <w:pPr/>
@@ -4460,7 +4460,7 @@
         </w:tc>
         <w:tc>
           <w:tcPr>
-            <w:tcW w:w="3903" w:type="dxa"/>
+            <w:tcW w:w="3789" w:type="dxa"/>
           </w:tcPr>
           <w:p>
             <w:pPr/>
@@ -4504,18 +4504,18 @@
         </w:tc>
         <w:tc>
           <w:tcPr>
-            <w:tcW w:w="2808" w:type="dxa"/>
-          </w:tcPr>
-          <w:p>
-            <w:pPr/>
-            <w:r>
-              <w:t xml:space="preserve">Dependen de los genomas FASTA de los fagos</w:t>
-            </w:r>
-          </w:p>
-        </w:tc>
-        <w:tc>
-          <w:tcPr>
-            <w:tcW w:w="3903" w:type="dxa"/>
+            <w:tcW w:w="2922" w:type="dxa"/>
+          </w:tcPr>
+          <w:p>
+            <w:pPr/>
+            <w:r>
+              <w:t xml:space="preserve">Dependen de los genomas FASTA de los fagos, que ya se descargaron; falta correr la detección</w:t>
+            </w:r>
+          </w:p>
+        </w:tc>
+        <w:tc>
+          <w:tcPr>
+            <w:tcW w:w="3789" w:type="dxa"/>
           </w:tcPr>
           <w:p>
             <w:pPr/>
@@ -4550,7 +4550,7 @@
         </w:tc>
         <w:tc>
           <w:tcPr>
-            <w:tcW w:w="2808" w:type="dxa"/>
+            <w:tcW w:w="2922" w:type="dxa"/>
           </w:tcPr>
           <w:p>
             <w:pPr/>
@@ -4561,7 +4561,7 @@
         </w:tc>
         <w:tc>
           <w:tcPr>
-            <w:tcW w:w="3903" w:type="dxa"/>
+            <w:tcW w:w="3789" w:type="dxa"/>
           </w:tcPr>
           <w:p>
             <w:pPr/>
@@ -4596,7 +4596,7 @@
         </w:tc>
         <w:tc>
           <w:tcPr>
-            <w:tcW w:w="2808" w:type="dxa"/>
+            <w:tcW w:w="2922" w:type="dxa"/>
           </w:tcPr>
           <w:p>
             <w:pPr/>
@@ -4607,7 +4607,7 @@
         </w:tc>
         <w:tc>
           <w:tcPr>
-            <w:tcW w:w="3903" w:type="dxa"/>
+            <w:tcW w:w="3789" w:type="dxa"/>
           </w:tcPr>
           <w:p>
             <w:pPr/>

</xml_diff>

<commit_message>
Fase 2: Informe de Avance con plazo del 30-10, abstract, conclusiones, referencias e indice
Reordena el plan en torno a la entrega 2 (ajuste A6), agrega Abstract y Resumen,
conclusiones y reflexion individuales, referencias, indice y numero de pagina.

Co-Authored-By: Claude Sonnet 5.5 <noreply@anthropic.com>
</commit_message>
<xml_diff>
--- a/Fase 2/2.4_APT122_InformeAvance_JohaoRamirez.docx
+++ b/Fase 2/2.4_APT122_InformeAvance_JohaoRamirez.docx
@@ -16,13 +16,197 @@
         <w:t xml:space="preserve">Versión final · </w:t>
       </w:r>
       <w:r>
-        <w:t xml:space="preserve">Oct 28, 2026</w:t>
+        <w:t xml:space="preserve">28 de octubre de 2026</w:t>
       </w:r>
       <w:r>
         <w:t xml:space="preserve"> · </w:t>
       </w:r>
       <w:r>
-        <w:t xml:space="preserve">@Johao</w:t>
+        <w:t xml:space="preserve">Johao Ramírez</w:t>
+      </w:r>
+    </w:p>
+    <w:p>
+      <w:pPr>
+        <w:keepNext/>
+        <w:spacing w:before="240" w:after="160"/>
+      </w:pPr>
+      <w:r>
+        <w:rPr>
+          <w:b/>
+          <w:sz w:val="28"/>
+        </w:rPr>
+        <w:t>Índice</w:t>
+      </w:r>
+    </w:p>
+    <w:p>
+      <w:pPr>
+        <w:spacing w:after="60"/>
+      </w:pPr>
+      <w:r>
+        <w:fldChar w:fldCharType="begin" w:dirty="true"/>
+      </w:r>
+      <w:r>
+        <w:instrText xml:space="preserve"> TOC \o "2-3" \h \z \u </w:instrText>
+      </w:r>
+      <w:r>
+        <w:fldChar w:fldCharType="separate"/>
+      </w:r>
+      <w:r>
+        <w:t xml:space="preserve">Antecedentes</w:t>
+      </w:r>
+    </w:p>
+    <w:p>
+      <w:pPr>
+        <w:spacing w:after="60"/>
+      </w:pPr>
+      <w:r>
+        <w:t xml:space="preserve">Abstract (English)</w:t>
+      </w:r>
+    </w:p>
+    <w:p>
+      <w:pPr>
+        <w:spacing w:after="60"/>
+      </w:pPr>
+      <w:r>
+        <w:t xml:space="preserve">Resumen (español)</w:t>
+      </w:r>
+    </w:p>
+    <w:p>
+      <w:pPr>
+        <w:spacing w:after="60"/>
+      </w:pPr>
+      <w:r>
+        <w:t xml:space="preserve">1. Resumen de avance</w:t>
+      </w:r>
+    </w:p>
+    <w:p>
+      <w:pPr>
+        <w:spacing w:after="60"/>
+        <w:ind w:left="360"/>
+      </w:pPr>
+      <w:r>
+        <w:t xml:space="preserve">1.1 Qué se ha hecho</w:t>
+      </w:r>
+    </w:p>
+    <w:p>
+      <w:pPr>
+        <w:spacing w:after="60"/>
+        <w:ind w:left="360"/>
+      </w:pPr>
+      <w:r>
+        <w:t xml:space="preserve">1.2 Estado de los objetivos específicos</w:t>
+      </w:r>
+    </w:p>
+    <w:p>
+      <w:pPr>
+        <w:spacing w:after="60"/>
+        <w:ind w:left="360"/>
+      </w:pPr>
+      <w:r>
+        <w:t xml:space="preserve">1.3 Objetivos</w:t>
+      </w:r>
+    </w:p>
+    <w:p>
+      <w:pPr>
+        <w:spacing w:after="60"/>
+        <w:ind w:left="360"/>
+      </w:pPr>
+      <w:r>
+        <w:t xml:space="preserve">1.4 Metodología</w:t>
+      </w:r>
+    </w:p>
+    <w:p>
+      <w:pPr>
+        <w:spacing w:after="60"/>
+        <w:ind w:left="360"/>
+      </w:pPr>
+      <w:r>
+        <w:t xml:space="preserve">1.5 Evidencias de avance</w:t>
+      </w:r>
+    </w:p>
+    <w:p>
+      <w:pPr>
+        <w:spacing w:after="60"/>
+      </w:pPr>
+      <w:r>
+        <w:t xml:space="preserve">2. Monitoreo del plan de trabajo</w:t>
+      </w:r>
+    </w:p>
+    <w:p>
+      <w:pPr>
+        <w:spacing w:after="60"/>
+      </w:pPr>
+      <w:r>
+        <w:t xml:space="preserve">3. Ajustes a partir del monitoreo</w:t>
+      </w:r>
+    </w:p>
+    <w:p>
+      <w:pPr>
+        <w:spacing w:after="60"/>
+        <w:ind w:left="360"/>
+      </w:pPr>
+      <w:r>
+        <w:t xml:space="preserve">3.1 Factores que han facilitado y dificultado el plan</w:t>
+      </w:r>
+    </w:p>
+    <w:p>
+      <w:pPr>
+        <w:spacing w:after="60"/>
+        <w:ind w:left="360"/>
+      </w:pPr>
+      <w:r>
+        <w:t xml:space="preserve">3.2 Actividades ajustadas o eliminadas</w:t>
+      </w:r>
+    </w:p>
+    <w:p>
+      <w:pPr>
+        <w:spacing w:after="60"/>
+        <w:ind w:left="360"/>
+      </w:pPr>
+      <w:r>
+        <w:t xml:space="preserve">3.3 Actividades pendientes y reprogramadas</w:t>
+      </w:r>
+    </w:p>
+    <w:p>
+      <w:pPr>
+        <w:spacing w:after="60"/>
+      </w:pPr>
+      <w:r>
+        <w:t xml:space="preserve">4. Individual conclusions</w:t>
+      </w:r>
+    </w:p>
+    <w:p>
+      <w:pPr>
+        <w:spacing w:after="60"/>
+      </w:pPr>
+      <w:r>
+        <w:t xml:space="preserve">5. Individual reflection</w:t>
+      </w:r>
+    </w:p>
+    <w:p>
+      <w:pPr>
+        <w:spacing w:after="60"/>
+      </w:pPr>
+      <w:r>
+        <w:t xml:space="preserve">Referencias</w:t>
+      </w:r>
+    </w:p>
+    <w:p>
+      <w:pPr>
+        <w:spacing w:after="60"/>
+      </w:pPr>
+      <w:r>
+        <w:t xml:space="preserve">Anexos</w:t>
+      </w:r>
+    </w:p>
+    <w:p>
+      <w:r>
+        <w:fldChar w:fldCharType="end"/>
+      </w:r>
+    </w:p>
+    <w:p>
+      <w:r>
+        <w:br w:type="page"/>
       </w:r>
     </w:p>
     <w:p>
@@ -301,33 +485,22 @@
         <w:pStyle w:val="Heading2"/>
       </w:pPr>
       <w:r>
-        <w:t xml:space="preserve">1. Resumen de avance</w:t>
+        <w:t xml:space="preserve">Abstract (English)</w:t>
       </w:r>
     </w:p>
     <w:p>
       <w:pPr/>
       <w:r>
-        <w:t xml:space="preserve">Al 28 de octubre el proyecto cumplió en borrador el OE1, avanzó parcialmente el OE2 con un corte funcional verificado y dio los primeros pasos del OE4 con una API y una web mínimas; los OE3 y OE5 aún no se inician.</w:t>
-      </w:r>
-    </w:p>
-    <w:p>
-      <w:pPr>
-        <w:pStyle w:val="Heading3"/>
-      </w:pPr>
-      <w:r>
-        <w:t xml:space="preserve">1.1 Qué se ha hecho</w:t>
-      </w:r>
-    </w:p>
-    <w:p>
-      <w:pPr/>
-      <w:r>
-        <w:t xml:space="preserve">Se redactó la Especificación de Requisitos de Software v0.2, con 66 requisitos funcionales, 33 no funcionales, 18 historias de usuario y 12 reglas de negocio. Se redactó también el Documento de Diseño v0.2: arquitectura, 24 tablas de PostgreSQL, 4 colecciones de MongoDB, 4 diagramas UML, el diseño de los requisitos no funcionales y un plan de 60 casos de prueba. Ambos documentos están pendientes de revisión del docente.</w:t>
-      </w:r>
-    </w:p>
-    <w:p>
-      <w:pPr/>
-      <w:r>
-        <w:t xml:space="preserve">Se construyó el corte funcional del pipeline genómico y del banco de fagos, empaquetado con docker compose en cuatro servicios (PostgreSQL, MongoDB, API y worker). Carga 200 fagos de </w:t>
+        <w:t xml:space="preserve">SIRFA (Sistema de Recomendación de Fagos frente a Antibiorresistencia) is an individual capstone project that aims to prioritize bacteriophage candidates against carbapenem-resistant </w:t>
+      </w:r>
+      <w:r>
+        <w:rPr>
+          <w:i/>
+        </w:rPr>
+        <w:t xml:space="preserve">Klebsiella pneumoniae</w:t>
+      </w:r>
+      <w:r>
+        <w:t xml:space="preserve"> isolates before laboratory testing. It does not diagnose or prescribe. This progress report covers the project up to 28 October 2026 (week 12 of an 18-week waterfall plan). The software requirements specification (66 functional and 33 non-functional requirements) and the design document (24 relational tables, 4 document collections, 4 UML diagrams and 60 test cases) were drafted. A first working slice was built: a genomic pipeline that validates a FASTA file, assesses assembly quality, verifies the species with Mash against 13 reference genomes, types the capsule locus with Kaptive and predicts genes with Prodigal; a bank of 200 </w:t>
       </w:r>
       <w:r>
         <w:rPr>
@@ -336,7 +509,82 @@
         <w:t xml:space="preserve">Klebsiella</w:t>
       </w:r>
       <w:r>
-        <w:t xml:space="preserve"> desde INPHARED y procesa un genoma real: valida el FASTA, calcula la calidad, verifica la especie con Mash, tipifica el locus K y predice los genes, con reintentos automáticos si una herramienta falla. El detalle medido está en la sección 1.5.</w:t>
+        <w:t xml:space="preserve"> phages with their genomes; a job queue with retries in PostgreSQL; a REST API; and a minimal web interface, covered by 102 automated tests. On a real genome the analysis finishes in about 20 seconds. The prediction model, authentication and roles, the dashboard and the mobile app have not been started. A minimal vertical flow is proposed as a fallback.</w:t>
+      </w:r>
+    </w:p>
+    <w:p>
+      <w:pPr>
+        <w:pStyle w:val="Heading2"/>
+      </w:pPr>
+      <w:r>
+        <w:t xml:space="preserve">Resumen (español)</w:t>
+      </w:r>
+    </w:p>
+    <w:p>
+      <w:pPr/>
+      <w:r>
+        <w:t xml:space="preserve">SIRFA (Sistema de Recomendación de Fagos frente a Antibiorresistencia) es un proyecto de título individual que busca priorizar bacteriófagos candidatos frente a aislados de </w:t>
+      </w:r>
+      <w:r>
+        <w:rPr>
+          <w:i/>
+        </w:rPr>
+        <w:t xml:space="preserve">Klebsiella pneumoniae</w:t>
+      </w:r>
+      <w:r>
+        <w:t xml:space="preserve"> resistentes a carbapenémicos antes del ensayo de laboratorio. No diagnostica ni prescribe. Este informe de avance cubre el proyecto hasta el 28 de octubre de 2026 (semana 12 de un plan en cascada de 18 semanas). Se redactaron la especificación de requisitos de software (66 requisitos funcionales y 33 no funcionales) y el documento de diseño (24 tablas relacionales, 4 colecciones documentales, 4 diagramas UML y 60 casos de prueba). Se construyó un primer corte funcional: un pipeline genómico que valida el archivo FASTA, evalúa la calidad del ensamblado, verifica la especie con Mash contra 13 genomas de referencia, tipifica el locus de la cápsula con Kaptive y predice los genes con Prodigal; un banco de 200 fagos de </w:t>
+      </w:r>
+      <w:r>
+        <w:rPr>
+          <w:i/>
+        </w:rPr>
+        <w:t xml:space="preserve">Klebsiella</w:t>
+      </w:r>
+      <w:r>
+        <w:t xml:space="preserve"> con sus genomas; una cola de trabajos con reintentos en PostgreSQL; una API REST y una web mínima, cubiertos por 102 pruebas automatizadas. Con un genoma real el análisis termina en unos 20 segundos. El modelo de predicción, la autenticación y los roles, el tablero y la app móvil no se han iniciado. Se propone un flujo vertical mínimo como respaldo.</w:t>
+      </w:r>
+    </w:p>
+    <w:p>
+      <w:pPr>
+        <w:pStyle w:val="Heading2"/>
+      </w:pPr>
+      <w:r>
+        <w:t xml:space="preserve">1. Resumen de avance</w:t>
+      </w:r>
+    </w:p>
+    <w:p>
+      <w:pPr/>
+      <w:r>
+        <w:t xml:space="preserve">Al 28 de octubre el proyecto cumplió en borrador el OE1, avanzó parcialmente el OE2 con un corte funcional verificado y dio los primeros pasos del OE4 con una API y una web mínimas; los OE3 y OE5 aún no se inician.</w:t>
+      </w:r>
+    </w:p>
+    <w:p>
+      <w:pPr>
+        <w:pStyle w:val="Heading3"/>
+      </w:pPr>
+      <w:r>
+        <w:t xml:space="preserve">1.1 Qué se ha hecho</w:t>
+      </w:r>
+    </w:p>
+    <w:p>
+      <w:pPr/>
+      <w:r>
+        <w:t xml:space="preserve">Se redactó la Especificación de Requisitos de Software v0.2, con 66 requisitos funcionales, 33 no funcionales, 18 historias de usuario y 12 reglas de negocio. Se redactó también el Documento de Diseño v0.2: arquitectura, 24 tablas de PostgreSQL, 4 colecciones de MongoDB, 4 diagramas UML, el diseño de los requisitos no funcionales y un plan de 60 casos de prueba. Ambos documentos están pendientes de revisión del docente.</w:t>
+      </w:r>
+    </w:p>
+    <w:p>
+      <w:pPr/>
+      <w:r>
+        <w:t xml:space="preserve">Se construyó el corte funcional del pipeline genómico y del banco de fagos, empaquetado con docker compose en cuatro servicios (PostgreSQL, MongoDB, API y worker). Carga 200 fagos de </w:t>
+      </w:r>
+      <w:r>
+        <w:rPr>
+          <w:i/>
+        </w:rPr>
+        <w:t xml:space="preserve">Klebsiella</w:t>
+      </w:r>
+      <w:r>
+        <w:t xml:space="preserve"> desde INPHARED (Cook et al., 2021) y procesa un genoma real: valida el FASTA, calcula la calidad, verifica la especie con Mash (Ondov et al., 2016), tipifica el locus K con Kaptive (Wyres et al., 2016) y predice los genes con Prodigal (Hyatt et al., 2010), con reintentos automáticos si una herramienta falla. El detalle medido está en la sección 1.5.</w:t>
       </w:r>
     </w:p>
     <w:p>
@@ -679,7 +927,7 @@
     <w:p>
       <w:pPr/>
       <w:r>
-        <w:t xml:space="preserve">El objetivo general y los cinco objetivos específicos se mantienen sin cambios respecto de la Definición de Proyecto de la Fase 1. Lo que se ajusta es el orden y la prioridad con que se construye el alcance de los OE3 a OE5 (sección 3.2).</w:t>
+        <w:t xml:space="preserve">El objetivo general y los cinco objetivos específicos se mantienen sin cambios respecto de la Definición de Proyecto de la Fase 1. Lo que se ajusta es el calendario, el orden y la prioridad con que se construye el alcance de los OE3 a OE5 (sección 3.2).</w:t>
       </w:r>
     </w:p>
     <w:p>
@@ -705,7 +953,7 @@
         </w:numPr>
       </w:pPr>
       <w:r>
-        <w:t xml:space="preserve">La etapa 1 estaba planificada para las semanas 5 y 6 y la etapa 2 para las semanas 6 y 7; ambas se redactaron en la semana 12. El traslape máximo de una semana entre etapas no se cumplió.</w:t>
+        <w:t xml:space="preserve">La etapa 1 estaba planificada en el Gantt de la Fase 1 para las semanas 5 y 6 y la etapa 2 para las semanas 6 y 7. El 29-10-2026 el docente indicó que todo lo de la entrega 2 debe estar subido el 30-10 (semana 12), y ambas etapas se cerraron para esa fecha (ajuste A6). Por eso se redactaron una tras otra y el traslape máximo de una semana entre etapas no se aplicó.</w:t>
       </w:r>
     </w:p>
     <w:p>
@@ -1150,7 +1398,7 @@
         <w:t xml:space="preserve">pneumoniae</w:t>
       </w:r>
       <w:r>
-        <w:t xml:space="preserve"> HS11286 (ensamblado completo GCF_000240185.1 de NCBI) para que lo tomara el worker.</w:t>
+        <w:t xml:space="preserve"> HS11286 (ensamblado completo GCF_000240185.1 de NCBI; Liu et al., 2012) para que lo tomara el worker.</w:t>
       </w:r>
     </w:p>
     <w:tbl>
@@ -2034,7 +2282,7 @@
     <w:p>
       <w:pPr/>
       <w:r>
-        <w:t xml:space="preserve">De las 18 filas del plan, 8 están completadas, 5 en curso, 1 con retraso y 4 sin iniciar; el responsable de todas las actividades es Johao Ramírez, por ser un proyecto individual.</w:t>
+        <w:t xml:space="preserve">De las 18 filas del plan, 8 están completadas, 6 en curso y 4 sin iniciar. La columna «Duración planificada» muestra el calendario ajustado en torno a la entrega 2, que el docente fijó el 29-10-2026 para el 30-10 (semana 12); el calendario original del Gantt de la Fase 1 está en el ajuste A6 (sección 3.2). El responsable de todas las actividades es Johao Ramírez, por ser un proyecto individual.</w:t>
       </w:r>
     </w:p>
     <w:tbl>
@@ -2101,7 +2349,7 @@
           <w:p>
             <w:pPr/>
             <w:r>
-              <w:t xml:space="preserve">Duración planificada</w:t>
+              <w:t xml:space="preserve">Duración planificada (calendario ajustado)</w:t>
             </w:r>
           </w:p>
         </w:tc>
@@ -2183,18 +2431,18 @@
           <w:p>
             <w:pPr/>
             <w:r>
-              <w:t xml:space="preserve">Semana 5</w:t>
-            </w:r>
-          </w:p>
-        </w:tc>
-        <w:tc>
-          <w:tcPr>
-            <w:tcW w:w="1337" w:type="dxa"/>
-          </w:tcPr>
-          <w:p>
-            <w:pPr/>
-            <w:r>
-              <w:t xml:space="preserve">Con retraso</w:t>
+              <w:t xml:space="preserve">Semana 12 (entrega 2)</w:t>
+            </w:r>
+          </w:p>
+        </w:tc>
+        <w:tc>
+          <w:tcPr>
+            <w:tcW w:w="1337" w:type="dxa"/>
+          </w:tcPr>
+          <w:p>
+            <w:pPr/>
+            <w:r>
+              <w:t xml:space="preserve">En curso</w:t>
             </w:r>
           </w:p>
         </w:tc>
@@ -2262,7 +2510,7 @@
           <w:p>
             <w:pPr/>
             <w:r>
-              <w:t xml:space="preserve">Semanas 5 y 6</w:t>
+              <w:t xml:space="preserve">Semana 12 (entrega 2)</w:t>
             </w:r>
           </w:p>
         </w:tc>
@@ -2341,7 +2589,7 @@
           <w:p>
             <w:pPr/>
             <w:r>
-              <w:t xml:space="preserve">Semanas 5 y 6</w:t>
+              <w:t xml:space="preserve">Semana 12 (entrega 2)</w:t>
             </w:r>
           </w:p>
         </w:tc>
@@ -2420,7 +2668,7 @@
           <w:p>
             <w:pPr/>
             <w:r>
-              <w:t xml:space="preserve">Semana 6</w:t>
+              <w:t xml:space="preserve">Semana 12 (entrega 2)</w:t>
             </w:r>
           </w:p>
         </w:tc>
@@ -2499,7 +2747,7 @@
           <w:p>
             <w:pPr/>
             <w:r>
-              <w:t xml:space="preserve">Semanas 6 y 7</w:t>
+              <w:t xml:space="preserve">Semana 12 (entrega 2)</w:t>
             </w:r>
           </w:p>
         </w:tc>
@@ -2578,7 +2826,7 @@
           <w:p>
             <w:pPr/>
             <w:r>
-              <w:t xml:space="preserve">Semana 7</w:t>
+              <w:t xml:space="preserve">Semana 12 (entrega 2)</w:t>
             </w:r>
           </w:p>
         </w:tc>
@@ -2657,7 +2905,7 @@
           <w:p>
             <w:pPr/>
             <w:r>
-              <w:t xml:space="preserve">Semana 7</w:t>
+              <w:t xml:space="preserve">Semana 12 (entrega 2)</w:t>
             </w:r>
           </w:p>
         </w:tc>
@@ -2736,7 +2984,7 @@
           <w:p>
             <w:pPr/>
             <w:r>
-              <w:t xml:space="preserve">Semana 8</w:t>
+              <w:t xml:space="preserve">Semana 13</w:t>
             </w:r>
           </w:p>
         </w:tc>
@@ -2821,7 +3069,7 @@
           <w:p>
             <w:pPr/>
             <w:r>
-              <w:t xml:space="preserve">Semana 8</w:t>
+              <w:t xml:space="preserve">Semana 12 (entrega 2)</w:t>
             </w:r>
           </w:p>
         </w:tc>
@@ -2843,7 +3091,7 @@
           <w:p>
             <w:pPr/>
             <w:r>
-              <w:t xml:space="preserve">Validación de FASTA y calidad (longitud, contigs, N50, GC y ambiguas), probadas con HS11286. Planificada para la semana 8</w:t>
+              <w:t xml:space="preserve">Validación de FASTA y calidad (longitud, contigs, N50, GC y ambiguas), probadas con HS11286.</w:t>
             </w:r>
           </w:p>
         </w:tc>
@@ -2900,7 +3148,7 @@
           <w:p>
             <w:pPr/>
             <w:r>
-              <w:t xml:space="preserve">Semana 9</w:t>
+              <w:t xml:space="preserve">Semana 12 (entrega 2)</w:t>
             </w:r>
           </w:p>
         </w:tc>
@@ -2979,7 +3227,7 @@
           <w:p>
             <w:pPr/>
             <w:r>
-              <w:t xml:space="preserve">Semana 9</w:t>
+              <w:t xml:space="preserve">Semana 13</w:t>
             </w:r>
           </w:p>
         </w:tc>
@@ -3058,7 +3306,7 @@
           <w:p>
             <w:pPr/>
             <w:r>
-              <w:t xml:space="preserve">Semanas 9 y 10</w:t>
+              <w:t xml:space="preserve">Semana 13</w:t>
             </w:r>
           </w:p>
         </w:tc>
@@ -3137,7 +3385,7 @@
           <w:p>
             <w:pPr/>
             <w:r>
-              <w:t xml:space="preserve">Semana 10</w:t>
+              <w:t xml:space="preserve">Semana 12 (entrega 2)</w:t>
             </w:r>
           </w:p>
         </w:tc>
@@ -3216,7 +3464,7 @@
           <w:p>
             <w:pPr/>
             <w:r>
-              <w:t xml:space="preserve">Semanas 11 y 12</w:t>
+              <w:t xml:space="preserve">Semanas 13 y 14</w:t>
             </w:r>
           </w:p>
         </w:tc>
@@ -3238,7 +3486,7 @@
           <w:p>
             <w:pPr/>
             <w:r>
-              <w:t xml:space="preserve">Debía iniciar en la semana 11; el tiempo lo consumieron las etapas 1 y 2 y la preparación del entorno</w:t>
+              <w:t xml:space="preserve">Inicia después de la entrega 2; las etapas 1 y 2 y la preparación del entorno ocuparon hasta la semana 12</w:t>
             </w:r>
           </w:p>
         </w:tc>
@@ -3295,7 +3543,7 @@
           <w:p>
             <w:pPr/>
             <w:r>
-              <w:t xml:space="preserve">Semanas 13 y 14</w:t>
+              <w:t xml:space="preserve">Semanas 13 a 15</w:t>
             </w:r>
           </w:p>
         </w:tc>
@@ -3582,7 +3830,7 @@
     <w:p>
       <w:pPr/>
       <w:r>
-        <w:t xml:space="preserve">El plan acumula 5 a 6 semanas de retraso en las etapas 1 y 2, y por eso se proponen ajustes de orden y de prioridad en lugar de eliminar actividades. Las fechas objetivo son propuestas que dependen de la conformidad del docente.</w:t>
+        <w:t xml:space="preserve">El 29-10-2026 el docente indicó que todo lo correspondiente a la entrega 2 debe estar subido el 30-10, y el calendario se reordena en torno a esa fecha: las etapas 1 y 2 y el primer corte del OE2 se cierran con esa entrega, y el modelo, la plataforma y el móvil pasan a las semanas 13 a 15. Además se proponen ajustes de orden y de prioridad en lugar de eliminar actividades; las fechas posteriores a la entrega 2 son propuestas que dependen de la conformidad del docente.</w:t>
       </w:r>
     </w:p>
     <w:p>
@@ -3679,9 +3927,9 @@
         <w:tblLook w:val="04A0" w:firstRow="1" w:lastRow="0" w:firstColumn="0" w:lastColumn="0" w:noHBand="0" w:noVBand="1"/>
       </w:tblPr>
       <w:tblGrid>
-        <w:gridCol w:w="3348"/>
-        <w:gridCol w:w="2125"/>
-        <w:gridCol w:w="3887"/>
+        <w:gridCol w:w="3163"/>
+        <w:gridCol w:w="2251"/>
+        <w:gridCol w:w="3946"/>
       </w:tblGrid>
       <w:tr>
         <w:trPr>
@@ -3689,7 +3937,7 @@
         </w:trPr>
         <w:tc>
           <w:tcPr>
-            <w:tcW w:w="3348" w:type="dxa"/>
+            <w:tcW w:w="3163" w:type="dxa"/>
             <w:shd w:val="clear" w:color="auto" w:fill="F2F2F2"/>
           </w:tcPr>
           <w:p>
@@ -3701,7 +3949,7 @@
         </w:tc>
         <w:tc>
           <w:tcPr>
-            <w:tcW w:w="2125" w:type="dxa"/>
+            <w:tcW w:w="2251" w:type="dxa"/>
             <w:shd w:val="clear" w:color="auto" w:fill="F2F2F2"/>
           </w:tcPr>
           <w:p>
@@ -3713,7 +3961,7 @@
         </w:tc>
         <w:tc>
           <w:tcPr>
-            <w:tcW w:w="3887" w:type="dxa"/>
+            <w:tcW w:w="3946" w:type="dxa"/>
             <w:shd w:val="clear" w:color="auto" w:fill="F2F2F2"/>
           </w:tcPr>
           <w:p>
@@ -3727,7 +3975,7 @@
       <w:tr>
         <w:tc>
           <w:tcPr>
-            <w:tcW w:w="3348" w:type="dxa"/>
+            <w:tcW w:w="3163" w:type="dxa"/>
           </w:tcPr>
           <w:p>
             <w:pPr/>
@@ -3738,31 +3986,31 @@
         </w:tc>
         <w:tc>
           <w:tcPr>
-            <w:tcW w:w="2125" w:type="dxa"/>
-          </w:tcPr>
-          <w:p>
-            <w:pPr/>
-            <w:r>
-              <w:t xml:space="preserve">Retraso de 5 a 6 semanas frente al Gantt; el modelo debía iniciar en la semana 11</w:t>
-            </w:r>
-          </w:p>
-        </w:tc>
-        <w:tc>
-          <w:tcPr>
-            <w:tcW w:w="3887" w:type="dxa"/>
-          </w:tcPr>
-          <w:p>
-            <w:pPr/>
-            <w:r>
-              <w:t xml:space="preserve">Ajustar el orden y la prioridad de la construcción (3.2) y pedir al docente la revisión de ambos documentos</w:t>
-            </w:r>
-          </w:p>
-        </w:tc>
-      </w:tr>
-      <w:tr>
-        <w:tc>
-          <w:tcPr>
-            <w:tcW w:w="3348" w:type="dxa"/>
+            <w:tcW w:w="2251" w:type="dxa"/>
+          </w:tcPr>
+          <w:p>
+            <w:pPr/>
+            <w:r>
+              <w:t xml:space="preserve">El Gantt de la Fase 1 las ubicaba en las semanas 5 a 7; el modelo, que iniciaba en la semana 11, pasa a la semana 13</w:t>
+            </w:r>
+          </w:p>
+        </w:tc>
+        <w:tc>
+          <w:tcPr>
+            <w:tcW w:w="3946" w:type="dxa"/>
+          </w:tcPr>
+          <w:p>
+            <w:pPr/>
+            <w:r>
+              <w:t xml:space="preserve">Recalendarizar en torno a la entrega 2 (A6), ajustar el orden y la prioridad de la construcción (3.2) y pedir al docente la revisión de ambos documentos</w:t>
+            </w:r>
+          </w:p>
+        </w:tc>
+      </w:tr>
+      <w:tr>
+        <w:tc>
+          <w:tcPr>
+            <w:tcW w:w="3163" w:type="dxa"/>
           </w:tcPr>
           <w:p>
             <w:pPr/>
@@ -3773,7 +4021,7 @@
         </w:tc>
         <w:tc>
           <w:tcPr>
-            <w:tcW w:w="2125" w:type="dxa"/>
+            <w:tcW w:w="2251" w:type="dxa"/>
           </w:tcPr>
           <w:p>
             <w:pPr/>
@@ -3784,7 +4032,7 @@
         </w:tc>
         <w:tc>
           <w:tcPr>
-            <w:tcW w:w="3887" w:type="dxa"/>
+            <w:tcW w:w="3946" w:type="dxa"/>
           </w:tcPr>
           <w:p>
             <w:pPr/>
@@ -3797,7 +4045,7 @@
       <w:tr>
         <w:tc>
           <w:tcPr>
-            <w:tcW w:w="3348" w:type="dxa"/>
+            <w:tcW w:w="3163" w:type="dxa"/>
           </w:tcPr>
           <w:p>
             <w:pPr/>
@@ -3808,18 +4056,18 @@
         </w:tc>
         <w:tc>
           <w:tcPr>
-            <w:tcW w:w="2125" w:type="dxa"/>
-          </w:tcPr>
-          <w:p>
-            <w:pPr/>
-            <w:r>
-              <w:t xml:space="preserve">Retrasó el inicio de la construcción</w:t>
-            </w:r>
-          </w:p>
-        </w:tc>
-        <w:tc>
-          <w:tcPr>
-            <w:tcW w:w="3887" w:type="dxa"/>
+            <w:tcW w:w="2251" w:type="dxa"/>
+          </w:tcPr>
+          <w:p>
+            <w:pPr/>
+            <w:r>
+              <w:t xml:space="preserve">Postergó el inicio de la construcción</w:t>
+            </w:r>
+          </w:p>
+        </w:tc>
+        <w:tc>
+          <w:tcPr>
+            <w:tcW w:w="3946" w:type="dxa"/>
           </w:tcPr>
           <w:p>
             <w:pPr/>
@@ -3838,7 +4086,7 @@
       <w:tr>
         <w:tc>
           <w:tcPr>
-            <w:tcW w:w="3348" w:type="dxa"/>
+            <w:tcW w:w="3163" w:type="dxa"/>
           </w:tcPr>
           <w:p>
             <w:pPr/>
@@ -3849,7 +4097,7 @@
         </w:tc>
         <w:tc>
           <w:tcPr>
-            <w:tcW w:w="2125" w:type="dxa"/>
+            <w:tcW w:w="2251" w:type="dxa"/>
           </w:tcPr>
           <w:p>
             <w:pPr/>
@@ -3860,7 +4108,7 @@
         </w:tc>
         <w:tc>
           <w:tcPr>
-            <w:tcW w:w="3887" w:type="dxa"/>
+            <w:tcW w:w="3946" w:type="dxa"/>
           </w:tcPr>
           <w:p>
             <w:pPr/>
@@ -3873,7 +4121,7 @@
       <w:tr>
         <w:tc>
           <w:tcPr>
-            <w:tcW w:w="3348" w:type="dxa"/>
+            <w:tcW w:w="3163" w:type="dxa"/>
           </w:tcPr>
           <w:p>
             <w:pPr/>
@@ -3884,7 +4132,7 @@
         </w:tc>
         <w:tc>
           <w:tcPr>
-            <w:tcW w:w="2125" w:type="dxa"/>
+            <w:tcW w:w="2251" w:type="dxa"/>
           </w:tcPr>
           <w:p>
             <w:pPr/>
@@ -3895,7 +4143,7 @@
         </w:tc>
         <w:tc>
           <w:tcPr>
-            <w:tcW w:w="3887" w:type="dxa"/>
+            <w:tcW w:w="3946" w:type="dxa"/>
           </w:tcPr>
           <w:p>
             <w:pPr/>
@@ -3917,7 +4165,7 @@
     <w:p>
       <w:pPr/>
       <w:r>
-        <w:t xml:space="preserve">No se elimina ninguna actividad. Se registran cinco ajustes; los tres primeros son propuestas que requieren la conformidad del docente.</w:t>
+        <w:t xml:space="preserve">No se elimina ninguna actividad. Se registran seis ajustes; A1 a A3 son propuestas que requieren la conformidad del docente, y A6 recoge el plazo que el docente indicó el 29-10-2026.</w:t>
       </w:r>
     </w:p>
     <w:tbl>
@@ -3929,9 +4177,9 @@
       </w:tblPr>
       <w:tblGrid>
         <w:gridCol w:w="720"/>
-        <w:gridCol w:w="3920"/>
-        <w:gridCol w:w="3376"/>
-        <w:gridCol w:w="1344"/>
+        <w:gridCol w:w="2843"/>
+        <w:gridCol w:w="4320"/>
+        <w:gridCol w:w="1477"/>
       </w:tblGrid>
       <w:tr>
         <w:trPr>
@@ -3951,7 +4199,7 @@
         </w:tc>
         <w:tc>
           <w:tcPr>
-            <w:tcW w:w="3920" w:type="dxa"/>
+            <w:tcW w:w="2843" w:type="dxa"/>
             <w:shd w:val="clear" w:color="auto" w:fill="F2F2F2"/>
           </w:tcPr>
           <w:p>
@@ -3963,7 +4211,7 @@
         </w:tc>
         <w:tc>
           <w:tcPr>
-            <w:tcW w:w="3376" w:type="dxa"/>
+            <w:tcW w:w="4320" w:type="dxa"/>
             <w:shd w:val="clear" w:color="auto" w:fill="F2F2F2"/>
           </w:tcPr>
           <w:p>
@@ -3975,7 +4223,7 @@
         </w:tc>
         <w:tc>
           <w:tcPr>
-            <w:tcW w:w="1344" w:type="dxa"/>
+            <w:tcW w:w="1477" w:type="dxa"/>
             <w:shd w:val="clear" w:color="auto" w:fill="F2F2F2"/>
           </w:tcPr>
           <w:p>
@@ -4000,7 +4248,7 @@
         </w:tc>
         <w:tc>
           <w:tcPr>
-            <w:tcW w:w="3920" w:type="dxa"/>
+            <w:tcW w:w="2843" w:type="dxa"/>
           </w:tcPr>
           <w:p>
             <w:pPr/>
@@ -4011,7 +4259,7 @@
         </w:tc>
         <w:tc>
           <w:tcPr>
-            <w:tcW w:w="3376" w:type="dxa"/>
+            <w:tcW w:w="4320" w:type="dxa"/>
           </w:tcPr>
           <w:p>
             <w:pPr/>
@@ -4022,7 +4270,7 @@
         </w:tc>
         <w:tc>
           <w:tcPr>
-            <w:tcW w:w="1344" w:type="dxa"/>
+            <w:tcW w:w="1477" w:type="dxa"/>
           </w:tcPr>
           <w:p>
             <w:pPr/>
@@ -4046,7 +4294,7 @@
         </w:tc>
         <w:tc>
           <w:tcPr>
-            <w:tcW w:w="3920" w:type="dxa"/>
+            <w:tcW w:w="2843" w:type="dxa"/>
           </w:tcPr>
           <w:p>
             <w:pPr/>
@@ -4057,7 +4305,7 @@
         </w:tc>
         <w:tc>
           <w:tcPr>
-            <w:tcW w:w="3376" w:type="dxa"/>
+            <w:tcW w:w="4320" w:type="dxa"/>
           </w:tcPr>
           <w:p>
             <w:pPr/>
@@ -4068,7 +4316,7 @@
         </w:tc>
         <w:tc>
           <w:tcPr>
-            <w:tcW w:w="1344" w:type="dxa"/>
+            <w:tcW w:w="1477" w:type="dxa"/>
           </w:tcPr>
           <w:p>
             <w:pPr/>
@@ -4092,7 +4340,7 @@
         </w:tc>
         <w:tc>
           <w:tcPr>
-            <w:tcW w:w="3920" w:type="dxa"/>
+            <w:tcW w:w="2843" w:type="dxa"/>
           </w:tcPr>
           <w:p>
             <w:pPr/>
@@ -4103,7 +4351,7 @@
         </w:tc>
         <w:tc>
           <w:tcPr>
-            <w:tcW w:w="3376" w:type="dxa"/>
+            <w:tcW w:w="4320" w:type="dxa"/>
           </w:tcPr>
           <w:p>
             <w:pPr/>
@@ -4114,7 +4362,7 @@
         </w:tc>
         <w:tc>
           <w:tcPr>
-            <w:tcW w:w="1344" w:type="dxa"/>
+            <w:tcW w:w="1477" w:type="dxa"/>
           </w:tcPr>
           <w:p>
             <w:pPr/>
@@ -4138,7 +4386,7 @@
         </w:tc>
         <w:tc>
           <w:tcPr>
-            <w:tcW w:w="3920" w:type="dxa"/>
+            <w:tcW w:w="2843" w:type="dxa"/>
           </w:tcPr>
           <w:p>
             <w:pPr/>
@@ -4149,7 +4397,7 @@
         </w:tc>
         <w:tc>
           <w:tcPr>
-            <w:tcW w:w="3376" w:type="dxa"/>
+            <w:tcW w:w="4320" w:type="dxa"/>
           </w:tcPr>
           <w:p>
             <w:pPr/>
@@ -4160,7 +4408,7 @@
         </w:tc>
         <w:tc>
           <w:tcPr>
-            <w:tcW w:w="1344" w:type="dxa"/>
+            <w:tcW w:w="1477" w:type="dxa"/>
           </w:tcPr>
           <w:p>
             <w:pPr/>
@@ -4184,7 +4432,7 @@
         </w:tc>
         <w:tc>
           <w:tcPr>
-            <w:tcW w:w="3920" w:type="dxa"/>
+            <w:tcW w:w="2843" w:type="dxa"/>
           </w:tcPr>
           <w:p>
             <w:pPr/>
@@ -4195,7 +4443,7 @@
         </w:tc>
         <w:tc>
           <w:tcPr>
-            <w:tcW w:w="3376" w:type="dxa"/>
+            <w:tcW w:w="4320" w:type="dxa"/>
           </w:tcPr>
           <w:p>
             <w:pPr/>
@@ -4206,7 +4454,7 @@
         </w:tc>
         <w:tc>
           <w:tcPr>
-            <w:tcW w:w="1344" w:type="dxa"/>
+            <w:tcW w:w="1477" w:type="dxa"/>
           </w:tcPr>
           <w:p>
             <w:pPr/>
@@ -4216,13 +4464,59 @@
           </w:p>
         </w:tc>
       </w:tr>
+      <w:tr>
+        <w:tc>
+          <w:tcPr>
+            <w:tcW w:w="720" w:type="dxa"/>
+          </w:tcPr>
+          <w:p>
+            <w:pPr/>
+            <w:r>
+              <w:t xml:space="preserve">A6</w:t>
+            </w:r>
+          </w:p>
+        </w:tc>
+        <w:tc>
+          <w:tcPr>
+            <w:tcW w:w="2843" w:type="dxa"/>
+          </w:tcPr>
+          <w:p>
+            <w:pPr/>
+            <w:r>
+              <w:t xml:space="preserve">Recalendarización en torno a la entrega 2 (30-10-2026, semana 12)</w:t>
+            </w:r>
+          </w:p>
+        </w:tc>
+        <w:tc>
+          <w:tcPr>
+            <w:tcW w:w="4320" w:type="dxa"/>
+          </w:tcPr>
+          <w:p>
+            <w:pPr/>
+            <w:r>
+              <w:t xml:space="preserve">El 29-10-2026 el docente indicó que todo lo de la entrega 2 debe estar subido el 30-10. El Gantt de la Fase 1 ubicaba la etapa 1 en las semanas 5 y 6, la etapa 2 en las 6 y 7, el OE2 en las 8 a 10, el modelo en las 11 y 12, la plataforma en las 13 y 14, la app móvil en la 14, las pruebas en la 15 y el cierre en las 16 a 18. Las etapas 1 y 2 y el primer corte del OE2 se cierran en la semana 12; el modelo pasa a las semanas 13 y 14 y la plataforma completa a las 13 a 15</w:t>
+            </w:r>
+          </w:p>
+        </w:tc>
+        <w:tc>
+          <w:tcPr>
+            <w:tcW w:w="1477" w:type="dxa"/>
+          </w:tcPr>
+          <w:p>
+            <w:pPr/>
+            <w:r>
+              <w:t xml:space="preserve">Aplicado: el plazo lo indicó el docente; la distribución posterior es propuesta</w:t>
+            </w:r>
+          </w:p>
+        </w:tc>
+      </w:tr>
     </w:tbl>
     <w:p>
       <w:pPr>
         <w:pStyle w:val="Heading3"/>
       </w:pPr>
       <w:r>
-        <w:t xml:space="preserve">3.3 Actividades no iniciadas o retrasadas</w:t>
+        <w:t xml:space="preserve">3.3 Actividades pendientes y reprogramadas</w:t>
       </w:r>
     </w:p>
     <w:tbl>
@@ -4234,8 +4528,8 @@
       </w:tblPr>
       <w:tblGrid>
         <w:gridCol w:w="1423"/>
-        <w:gridCol w:w="2922"/>
-        <w:gridCol w:w="3789"/>
+        <w:gridCol w:w="2909"/>
+        <w:gridCol w:w="3802"/>
         <w:gridCol w:w="1226"/>
       </w:tblGrid>
       <w:tr>
@@ -4256,7 +4550,7 @@
         </w:tc>
         <w:tc>
           <w:tcPr>
-            <w:tcW w:w="2922" w:type="dxa"/>
+            <w:tcW w:w="2909" w:type="dxa"/>
             <w:shd w:val="clear" w:color="auto" w:fill="F2F2F2"/>
           </w:tcPr>
           <w:p>
@@ -4268,7 +4562,7 @@
         </w:tc>
         <w:tc>
           <w:tcPr>
-            <w:tcW w:w="3789" w:type="dxa"/>
+            <w:tcW w:w="3802" w:type="dxa"/>
             <w:shd w:val="clear" w:color="auto" w:fill="F2F2F2"/>
           </w:tcPr>
           <w:p>
@@ -4305,7 +4599,7 @@
         </w:tc>
         <w:tc>
           <w:tcPr>
-            <w:tcW w:w="2922" w:type="dxa"/>
+            <w:tcW w:w="2909" w:type="dxa"/>
           </w:tcPr>
           <w:p>
             <w:pPr/>
@@ -4316,7 +4610,7 @@
         </w:tc>
         <w:tc>
           <w:tcPr>
-            <w:tcW w:w="3789" w:type="dxa"/>
+            <w:tcW w:w="3802" w:type="dxa"/>
           </w:tcPr>
           <w:p>
             <w:pPr/>
@@ -4351,7 +4645,7 @@
         </w:tc>
         <w:tc>
           <w:tcPr>
-            <w:tcW w:w="2922" w:type="dxa"/>
+            <w:tcW w:w="2909" w:type="dxa"/>
           </w:tcPr>
           <w:p>
             <w:pPr/>
@@ -4362,7 +4656,7 @@
         </w:tc>
         <w:tc>
           <w:tcPr>
-            <w:tcW w:w="3789" w:type="dxa"/>
+            <w:tcW w:w="3802" w:type="dxa"/>
           </w:tcPr>
           <w:p>
             <w:pPr/>
@@ -4397,7 +4691,7 @@
         </w:tc>
         <w:tc>
           <w:tcPr>
-            <w:tcW w:w="2922" w:type="dxa"/>
+            <w:tcW w:w="2909" w:type="dxa"/>
           </w:tcPr>
           <w:p>
             <w:pPr/>
@@ -4408,7 +4702,7 @@
         </w:tc>
         <w:tc>
           <w:tcPr>
-            <w:tcW w:w="3789" w:type="dxa"/>
+            <w:tcW w:w="3802" w:type="dxa"/>
           </w:tcPr>
           <w:p>
             <w:pPr/>
@@ -4449,7 +4743,7 @@
         </w:tc>
         <w:tc>
           <w:tcPr>
-            <w:tcW w:w="2922" w:type="dxa"/>
+            <w:tcW w:w="2909" w:type="dxa"/>
           </w:tcPr>
           <w:p>
             <w:pPr/>
@@ -4460,7 +4754,7 @@
         </w:tc>
         <w:tc>
           <w:tcPr>
-            <w:tcW w:w="3789" w:type="dxa"/>
+            <w:tcW w:w="3802" w:type="dxa"/>
           </w:tcPr>
           <w:p>
             <w:pPr/>
@@ -4504,7 +4798,7 @@
         </w:tc>
         <w:tc>
           <w:tcPr>
-            <w:tcW w:w="2922" w:type="dxa"/>
+            <w:tcW w:w="2909" w:type="dxa"/>
           </w:tcPr>
           <w:p>
             <w:pPr/>
@@ -4515,7 +4809,7 @@
         </w:tc>
         <w:tc>
           <w:tcPr>
-            <w:tcW w:w="3789" w:type="dxa"/>
+            <w:tcW w:w="3802" w:type="dxa"/>
           </w:tcPr>
           <w:p>
             <w:pPr/>
@@ -4550,7 +4844,7 @@
         </w:tc>
         <w:tc>
           <w:tcPr>
-            <w:tcW w:w="2922" w:type="dxa"/>
+            <w:tcW w:w="2909" w:type="dxa"/>
           </w:tcPr>
           <w:p>
             <w:pPr/>
@@ -4561,12 +4855,12 @@
         </w:tc>
         <w:tc>
           <w:tcPr>
-            <w:tcW w:w="3789" w:type="dxa"/>
-          </w:tcPr>
-          <w:p>
-            <w:pPr/>
-            <w:r>
-              <w:t xml:space="preserve">Embeddings con una variante reducida de ESM-2 sobre el banco ya cargado y el conjunto de interacciones de Boeckaerts et al.; XGBoost con validación cruzada</w:t>
+            <w:tcW w:w="3802" w:type="dxa"/>
+          </w:tcPr>
+          <w:p>
+            <w:pPr/>
+            <w:r>
+              <w:t xml:space="preserve">Embeddings con una variante reducida de ESM-2 sobre el banco ya cargado y el conjunto de interacciones de Boeckaerts et al. (2024); XGBoost con validación cruzada</w:t>
             </w:r>
           </w:p>
         </w:tc>
@@ -4596,7 +4890,7 @@
         </w:tc>
         <w:tc>
           <w:tcPr>
-            <w:tcW w:w="2922" w:type="dxa"/>
+            <w:tcW w:w="2909" w:type="dxa"/>
           </w:tcPr>
           <w:p>
             <w:pPr/>
@@ -4607,7 +4901,7 @@
         </w:tc>
         <w:tc>
           <w:tcPr>
-            <w:tcW w:w="3789" w:type="dxa"/>
+            <w:tcW w:w="3802" w:type="dxa"/>
           </w:tcPr>
           <w:p>
             <w:pPr/>
@@ -4635,12 +4929,349 @@
         <w:t xml:space="preserve">Plan B propuesto: si el modelo o la plataforma completa no alcanzan, el Informe Final presenta el flujo vertical mínimo y declara de forma explícita lo que quedó sin construir.</w:t>
       </w:r>
     </w:p>
+    <w:p>
+      <w:pPr>
+        <w:pStyle w:val="Heading2"/>
+      </w:pPr>
+      <w:r>
+        <w:t xml:space="preserve">4. Individual conclusions</w:t>
+      </w:r>
+    </w:p>
+    <w:p>
+      <w:pPr>
+        <w:pStyle w:val="ListParagraph"/>
+        <w:numPr>
+          <w:ilvl w:val="0"/>
+          <w:numId w:val="5"/>
+        </w:numPr>
+      </w:pPr>
+      <w:r>
+        <w:rPr>
+          <w:b/>
+        </w:rPr>
+        <w:t xml:space="preserve">The first working slice is real, but it is not the product.</w:t>
+      </w:r>
+      <w:r>
+        <w:t xml:space="preserve"> After twelve weeks, SIRFA can take an assembled </w:t>
+      </w:r>
+      <w:r>
+        <w:rPr>
+          <w:i/>
+        </w:rPr>
+        <w:t xml:space="preserve">Klebsiella pneumoniae</w:t>
+      </w:r>
+      <w:r>
+        <w:t xml:space="preserve"> genome and return its quality, species, capsule locus and genes in about twenty seconds, with every step traceable. It cannot yet say which phage to try, because the prediction model has not been started.</w:t>
+      </w:r>
+    </w:p>
+    <w:p>
+      <w:pPr>
+        <w:pStyle w:val="ListParagraph"/>
+        <w:numPr>
+          <w:ilvl w:val="0"/>
+          <w:numId w:val="5"/>
+        </w:numPr>
+      </w:pPr>
+      <w:r>
+        <w:rPr>
+          <w:b/>
+        </w:rPr>
+        <w:t xml:space="preserve">Checking the tools against real data paid off.</w:t>
+      </w:r>
+      <w:r>
+        <w:t xml:space="preserve"> Running the pipeline on real genomes exposed three errors that the unit tests had not caught: the Kaptive command line, the source version recorded when the phage bank is loaded twice, and a wrong validation message. All three were fixed.</w:t>
+      </w:r>
+    </w:p>
+    <w:p>
+      <w:pPr>
+        <w:pStyle w:val="ListParagraph"/>
+        <w:numPr>
+          <w:ilvl w:val="0"/>
+          <w:numId w:val="5"/>
+        </w:numPr>
+      </w:pPr>
+      <w:r>
+        <w:rPr>
+          <w:b/>
+        </w:rPr>
+        <w:t xml:space="preserve">The data decide what can be claimed.</w:t>
+      </w:r>
+      <w:r>
+        <w:t xml:space="preserve"> The phage bank holds 200 phages with an unknown life cycle and no known phage-strain interactions. For that reason the candidate screen does not rank phages and says so, instead of inventing an order.</w:t>
+      </w:r>
+    </w:p>
+    <w:p>
+      <w:pPr>
+        <w:pStyle w:val="ListParagraph"/>
+        <w:numPr>
+          <w:ilvl w:val="0"/>
+          <w:numId w:val="5"/>
+        </w:numPr>
+      </w:pPr>
+      <w:r>
+        <w:rPr>
+          <w:b/>
+        </w:rPr>
+        <w:t xml:space="preserve">The limits are explicit.</w:t>
+      </w:r>
+      <w:r>
+        <w:t xml:space="preserve"> The species check was validated with six independent genomes, which is a small, non-statistical test; the quality thresholds are initial values that still need calibration; and the system has no authentication yet.</w:t>
+      </w:r>
+    </w:p>
+    <w:p>
+      <w:pPr>
+        <w:pStyle w:val="ListParagraph"/>
+        <w:numPr>
+          <w:ilvl w:val="0"/>
+          <w:numId w:val="5"/>
+        </w:numPr>
+      </w:pPr>
+      <w:r>
+        <w:rPr>
+          <w:b/>
+        </w:rPr>
+        <w:t xml:space="preserve">The scope is the main risk.</w:t>
+      </w:r>
+      <w:r>
+        <w:t xml:space="preserve"> The full scope (prediction model, authentication and roles, dashboard and mobile app) is large for one developer. A minimal vertical flow (registration, pipeline, prediction, validation and recommendation) is the fallback if it does not fit.</w:t>
+      </w:r>
+    </w:p>
+    <w:p>
+      <w:pPr>
+        <w:pStyle w:val="ListParagraph"/>
+        <w:numPr>
+          <w:ilvl w:val="0"/>
+          <w:numId w:val="5"/>
+        </w:numPr>
+      </w:pPr>
+      <w:r>
+        <w:rPr>
+          <w:b/>
+        </w:rPr>
+        <w:t xml:space="preserve">Next steps.</w:t>
+      </w:r>
+      <w:r>
+        <w:t xml:space="preserve"> Reduced ESM-2 embeddings with XGBoost trained on published interactions, detection of receptor-binding proteins in the 200 phage genomes already downloaded, authentication with roles, and the missing data sources (PhageScope and Microbe Versus Phage).</w:t>
+      </w:r>
+    </w:p>
+    <w:p>
+      <w:pPr>
+        <w:pStyle w:val="Heading2"/>
+      </w:pPr>
+      <w:r>
+        <w:t xml:space="preserve">5. Individual reflection</w:t>
+      </w:r>
+    </w:p>
+    <w:p>
+      <w:pPr/>
+      <w:r>
+        <w:rPr>
+          <w:b/>
+        </w:rPr>
+        <w:t xml:space="preserve">What worked.</w:t>
+      </w:r>
+      <w:r>
+        <w:t xml:space="preserve"> A waterfall model suited working alone: there is no team to coordinate, and the course milestones act as stage gates. Writing tests together with each module and running everything in Docker made changes safe to make and the environment easy to rebuild.</w:t>
+      </w:r>
+    </w:p>
+    <w:p>
+      <w:pPr/>
+      <w:r>
+        <w:rPr>
+          <w:b/>
+        </w:rPr>
+        <w:t xml:space="preserve">What was hard.</w:t>
+      </w:r>
+      <w:r>
+        <w:t xml:space="preserve"> The main difficulty was the size of the scope. Setting up the development environment (Docker Desktop required WSL2, administrator rights and several restarts) took time at the start. The scope is large for one developer: 48 of the 66 functional requirements were given high priority. There were data problems too: INPHARED moved to INPHARED2, whose downloadable table is not yet available, and the phage lengths come in rounded kilobases.</w:t>
+      </w:r>
+    </w:p>
+    <w:p>
+      <w:pPr/>
+      <w:r>
+        <w:rPr>
+          <w:b/>
+        </w:rPr>
+        <w:t xml:space="preserve">What I learned.</w:t>
+      </w:r>
+      <w:r>
+        <w:t xml:space="preserve"> Most of the effort went into reliability, traceability and verification rather than into biology, which confirms what I wrote in the project definition: the central challenge of this project is software engineering. I also learned to state limits plainly, so that a small validation is reported as small, and that a minimal flow that works end to end is worth more than many half-built modules.</w:t>
+      </w:r>
+    </w:p>
+    <w:p>
+      <w:pPr/>
+      <w:r>
+        <w:rPr>
+          <w:b/>
+        </w:rPr>
+        <w:t xml:space="preserve">What I would do differently.</w:t>
+      </w:r>
+      <w:r>
+        <w:t xml:space="preserve"> I would start collecting the interaction data for the model earlier and prioritize the requirements from the beginning.</w:t>
+      </w:r>
+    </w:p>
+    <w:p>
+      <w:pPr>
+        <w:pStyle w:val="Heading2"/>
+      </w:pPr>
+      <w:r>
+        <w:t xml:space="preserve">Referencias</w:t>
+      </w:r>
+    </w:p>
+    <w:p>
+      <w:pPr/>
+      <w:r>
+        <w:t xml:space="preserve">Boeckaerts, D., Stock, M., Ferriol-González, C., Oteo-Iglesias, J., Sanjuán, R., Domingo-Calap, P., De Baets, B., &amp; Briers, Y. (2024). Prediction of Klebsiella phage-host specificity at the strain level. </w:t>
+      </w:r>
+      <w:r>
+        <w:rPr>
+          <w:i/>
+        </w:rPr>
+        <w:t xml:space="preserve">Nature Communications, 15</w:t>
+      </w:r>
+      <w:r>
+        <w:t xml:space="preserve">, Article 4355. https://doi.org/10.1038/s41467-024-48675-6</w:t>
+      </w:r>
+    </w:p>
+    <w:p>
+      <w:pPr/>
+      <w:r>
+        <w:t xml:space="preserve">Cook, R., et al. (2021). INfrastructure for a PHAge REference Database: Identification of large-scale biases in the current collection of cultured phage genomes. </w:t>
+      </w:r>
+      <w:r>
+        <w:rPr>
+          <w:i/>
+        </w:rPr>
+        <w:t xml:space="preserve">PHAGE, 2</w:t>
+      </w:r>
+      <w:r>
+        <w:t xml:space="preserve">(4), 214–223. https://doi.org/10.1089/phage.2021.0007</w:t>
+      </w:r>
+    </w:p>
+    <w:p>
+      <w:pPr/>
+      <w:r>
+        <w:t xml:space="preserve">Cook, R., et al. (2026). Bacteriophage genomics: What has five years of INPHARED taught us? </w:t>
+      </w:r>
+      <w:r>
+        <w:rPr>
+          <w:i/>
+        </w:rPr>
+        <w:t xml:space="preserve">bioRxiv</w:t>
+      </w:r>
+      <w:r>
+        <w:t xml:space="preserve">. https://www.biorxiv.org/content/10.64898/2026.05.06.722914v1</w:t>
+      </w:r>
+    </w:p>
+    <w:p>
+      <w:pPr/>
+      <w:r>
+        <w:t xml:space="preserve">Hyatt, D., Chen, G.-L., LoCascio, P. F., Land, M. L., Larimer, F. W., &amp; Hauser, L. J. (2010). Prodigal: Prokaryotic gene recognition and translation initiation site identification. </w:t>
+      </w:r>
+      <w:r>
+        <w:rPr>
+          <w:i/>
+        </w:rPr>
+        <w:t xml:space="preserve">BMC Bioinformatics, 11</w:t>
+      </w:r>
+      <w:r>
+        <w:t xml:space="preserve">, Article 119. https://doi.org/10.1186/1471-2105-11-119</w:t>
+      </w:r>
+    </w:p>
+    <w:p>
+      <w:pPr/>
+      <w:r>
+        <w:t xml:space="preserve">Liu, P., et al. (2012). Complete genome sequence of Klebsiella pneumoniae subsp. pneumoniae HS11286, a multidrug-resistant strain isolated from human sputum. </w:t>
+      </w:r>
+      <w:r>
+        <w:rPr>
+          <w:i/>
+        </w:rPr>
+        <w:t xml:space="preserve">Journal of Bacteriology, 194</w:t>
+      </w:r>
+      <w:r>
+        <w:t xml:space="preserve">(7), 1841–1842. https://pmc.ncbi.nlm.nih.gov/articles/PMC3302456</w:t>
+      </w:r>
+    </w:p>
+    <w:p>
+      <w:pPr/>
+      <w:r>
+        <w:t xml:space="preserve">Ondov, B. D., Treangen, T. J., Melsted, P., Mallonee, A. B., Bergman, N. H., Koren, S., &amp; Phillippy, A. M. (2016). Mash: Fast genome and metagenome distance estimation using MinHash. </w:t>
+      </w:r>
+      <w:r>
+        <w:rPr>
+          <w:i/>
+        </w:rPr>
+        <w:t xml:space="preserve">Genome Biology, 17</w:t>
+      </w:r>
+      <w:r>
+        <w:t xml:space="preserve">, Article 132. https://doi.org/10.1186/s13059-016-0997-x</w:t>
+      </w:r>
+    </w:p>
+    <w:p>
+      <w:pPr/>
+      <w:r>
+        <w:t xml:space="preserve">Wyres, K. L., Wick, R. R., Gorrie, C., Jenney, A., Follador, R., Thomson, N. R., &amp; Holt, K. E. (2016). Identification of Klebsiella capsule synthesis loci from whole genome data. </w:t>
+      </w:r>
+      <w:r>
+        <w:rPr>
+          <w:i/>
+        </w:rPr>
+        <w:t xml:space="preserve">Microbial Genomics, 2</w:t>
+      </w:r>
+      <w:r>
+        <w:t xml:space="preserve">(12), Article e000102. https://pubmed.ncbi.nlm.nih.gov/28348840/</w:t>
+      </w:r>
+    </w:p>
+    <w:p>
+      <w:pPr>
+        <w:pStyle w:val="Heading2"/>
+      </w:pPr>
+      <w:r>
+        <w:t xml:space="preserve">Anexos</w:t>
+      </w:r>
+    </w:p>
+    <w:p>
+      <w:pPr/>
+      <w:r>
+        <w:t xml:space="preserve">Anexo A: Especificación de Requisitos de Software v0.2 (Adjunto A). Anexo B: Documento de Diseño v0.2 (Adjunto B). Los registros de ejecución y las pruebas están en la sección 1.5.</w:t>
+      </w:r>
+    </w:p>
     <w:sectPr>
+      <w:footerReference w:type="default" r:id="rId90"/>
       <w:pgSz w:w="12240" w:h="15840"/>
       <w:pgMar w:top="1440" w:right="1440" w:bottom="1440" w:left="1440" w:header="720" w:footer="720" w:gutter="0"/>
     </w:sectPr>
   </w:body>
 </w:document>
+</file>
+
+<file path=word/footer1.xml><?xml version="1.0" encoding="utf-8"?>
+<w:ftr xmlns:w="http://schemas.openxmlformats.org/wordprocessingml/2006/main" xmlns:r="http://schemas.openxmlformats.org/officeDocument/2006/relationships">
+  <w:p>
+    <w:pPr>
+      <w:jc w:val="center"/>
+    </w:pPr>
+    <w:r>
+      <w:t xml:space="preserve">Página </w:t>
+    </w:r>
+    <w:r>
+      <w:fldChar w:fldCharType="begin"/>
+    </w:r>
+    <w:r>
+      <w:instrText xml:space="preserve"> PAGE </w:instrText>
+    </w:r>
+    <w:r>
+      <w:fldChar w:fldCharType="separate"/>
+    </w:r>
+    <w:r>
+      <w:t>1</w:t>
+    </w:r>
+    <w:r>
+      <w:fldChar w:fldCharType="end"/>
+    </w:r>
+  </w:p>
+</w:ftr>
 </file>
 
 <file path=word/numbering.xml><?xml version="1.0" encoding="utf-8"?>
@@ -4825,6 +5456,12 @@
   <w:num w:numId="4">
     <w:abstractNumId w:val="0"/>
   </w:num>
+  <w:num w:numId="5">
+    <w:abstractNumId w:val="1"/>
+    <w:lvlOverride w:ilvl="0">
+      <w:startOverride w:val="1"/>
+    </w:lvlOverride>
+  </w:num>
 </w:numbering>
 </file>
 
@@ -4836,7 +5473,7 @@
         <w:rFonts w:ascii="Calibri" w:hAnsi="Calibri" w:eastAsia="Calibri" w:cs="Calibri"/>
         <w:sz w:val="22"/>
         <w:szCs w:val="22"/>
-        <w:lang w:val="en-US"/>
+        <w:lang w:val="es-CL"/>
       </w:rPr>
     </w:rPrDefault>
     <w:pPrDefault>

</xml_diff>

<commit_message>
Fase 2: Informe de Avance con portada, interlineado 1,0 y OE4 y E3 coherentes
Agrega portada al Word, deja el interlineado en 1,0 (la rubrica pide 1,0 o 1,5),
pasa el OE4 de No iniciado a En curso en la tabla 1.2 para que coincida con el
plan y reemplaza el marcador de URL de la evidencia E3 por el estado real
(codigo local, sin publicar).

Co-Authored-By: Claude Sonnet 5.5 <noreply@anthropic.com>
</commit_message>
<xml_diff>
--- a/Fase 2/2.4_APT122_InformeAvance_JohaoRamirez.docx
+++ b/Fase 2/2.4_APT122_InformeAvance_JohaoRamirez.docx
@@ -2,6 +2,130 @@
 <file path=word/document.xml><?xml version="1.0" encoding="utf-8"?>
 <w:document xmlns:w="http://schemas.openxmlformats.org/wordprocessingml/2006/main" xmlns:r="http://schemas.openxmlformats.org/officeDocument/2006/relationships" xmlns:wp="http://schemas.openxmlformats.org/drawingml/2006/wordprocessingDrawing" xmlns:a="http://schemas.openxmlformats.org/drawingml/2006/main" xmlns:pic="http://schemas.openxmlformats.org/drawingml/2006/picture">
   <w:body>
+    <w:p>
+      <w:pPr>
+        <w:spacing w:before="1200" w:after="120"/>
+        <w:jc w:val="center"/>
+      </w:pPr>
+      <w:r>
+        <w:rPr>
+          <w:sz w:val="26"/>
+          <w:szCs w:val="26"/>
+        </w:rPr>
+        <w:t xml:space="preserve">Duoc UC · Escuela de Informática y Telecomunicaciones</w:t>
+      </w:r>
+    </w:p>
+    <w:p>
+      <w:pPr>
+        <w:spacing w:before="0" w:after="120"/>
+        <w:jc w:val="center"/>
+      </w:pPr>
+      <w:r>
+        <w:rPr>
+          <w:sz w:val="24"/>
+          <w:szCs w:val="24"/>
+        </w:rPr>
+        <w:t xml:space="preserve">Sede San Joaquín</w:t>
+      </w:r>
+    </w:p>
+    <w:p>
+      <w:pPr>
+        <w:spacing w:before="2200" w:after="120"/>
+        <w:jc w:val="center"/>
+      </w:pPr>
+      <w:r>
+        <w:rPr>
+          <w:b/>
+          <w:sz w:val="32"/>
+          <w:szCs w:val="32"/>
+        </w:rPr>
+        <w:t xml:space="preserve">Informe de Avance · Fase 2</w:t>
+      </w:r>
+    </w:p>
+    <w:p>
+      <w:pPr>
+        <w:spacing w:before="240" w:after="120"/>
+        <w:jc w:val="center"/>
+      </w:pPr>
+      <w:r>
+        <w:rPr>
+          <w:b/>
+          <w:sz w:val="64"/>
+          <w:szCs w:val="64"/>
+        </w:rPr>
+        <w:t xml:space="preserve">SIRFA</w:t>
+      </w:r>
+    </w:p>
+    <w:p>
+      <w:pPr>
+        <w:spacing w:before="0" w:after="1400"/>
+        <w:jc w:val="center"/>
+      </w:pPr>
+      <w:r>
+        <w:rPr>
+          <w:sz w:val="30"/>
+          <w:szCs w:val="30"/>
+        </w:rPr>
+        <w:t xml:space="preserve">Sistema de Recomendación de Fagos frente a Antibiorresistencia</w:t>
+      </w:r>
+    </w:p>
+    <w:p>
+      <w:pPr>
+        <w:spacing w:before="0" w:after="120"/>
+        <w:jc w:val="center"/>
+      </w:pPr>
+      <w:r>
+        <w:rPr>
+          <w:sz w:val="24"/>
+          <w:szCs w:val="24"/>
+        </w:rPr>
+        <w:t xml:space="preserve">Proyecto APT · Capstone PTY4614 / APT122</w:t>
+      </w:r>
+    </w:p>
+    <w:p>
+      <w:pPr>
+        <w:spacing w:before="0" w:after="120"/>
+        <w:jc w:val="center"/>
+      </w:pPr>
+      <w:r>
+        <w:rPr>
+          <w:sz w:val="24"/>
+          <w:szCs w:val="24"/>
+        </w:rPr>
+        <w:t xml:space="preserve">Carrera: Ingeniería en Informática</w:t>
+      </w:r>
+    </w:p>
+    <w:p>
+      <w:pPr>
+        <w:spacing w:before="0" w:after="120"/>
+        <w:jc w:val="center"/>
+      </w:pPr>
+      <w:r>
+        <w:rPr>
+          <w:sz w:val="24"/>
+          <w:szCs w:val="24"/>
+        </w:rPr>
+        <w:t xml:space="preserve">Estudiante: Johao Ramírez (proyecto individual)</w:t>
+      </w:r>
+    </w:p>
+    <w:p>
+      <w:pPr>
+        <w:spacing w:before="600" w:after="120"/>
+        <w:jc w:val="center"/>
+      </w:pPr>
+      <w:r>
+        <w:rPr>
+          <w:sz w:val="24"/>
+          <w:szCs w:val="24"/>
+        </w:rPr>
+        <w:t xml:space="preserve">Entrega 2: 30 de octubre de 2026 · Corte de avance: 28 de octubre de 2026</w:t>
+      </w:r>
+    </w:p>
+    <w:p>
+      <w:r>
+        <w:br w:type="page"/>
+      </w:r>
+    </w:p>
     <w:p>
       <w:pPr>
         <w:pStyle w:val="Heading1"/>
@@ -474,7 +598,7 @@
           <w:p>
             <w:pPr/>
             <w:r>
-              <w:t xml:space="preserve">Versión final para entrega; falta completar la URL del repositorio institucional en la evidencia E3</w:t>
+              <w:t xml:space="preserve">Versión final para entrega; el código del corte funcional aún no está publicado en un repositorio (evidencia E3 y sección 3.3)</w:t>
             </w:r>
           </w:p>
         </w:tc>
@@ -842,7 +966,7 @@
           <w:p>
             <w:pPr/>
             <w:r>
-              <w:t xml:space="preserve">No iniciado</w:t>
+              <w:t xml:space="preserve">En curso</w:t>
             </w:r>
           </w:p>
         </w:tc>
@@ -1217,7 +1341,7 @@
           <w:p>
             <w:pPr/>
             <w:r>
-              <w:t xml:space="preserve">Repositorio [URL del repositorio institucional], carpetas </w:t>
+              <w:t xml:space="preserve">Repositorio local de SIRFA, aún sin publicar (ver 3.3), carpetas </w:t>
             </w:r>
             <w:r>
               <w:rPr>
@@ -5241,6 +5365,7 @@
       <w:footerReference w:type="default" r:id="rId90"/>
       <w:pgSz w:w="12240" w:h="15840"/>
       <w:pgMar w:top="1440" w:right="1440" w:bottom="1440" w:left="1440" w:header="720" w:footer="720" w:gutter="0"/>
+      <w:titlePg/>
     </w:sectPr>
   </w:body>
 </w:document>
@@ -5478,7 +5603,7 @@
     </w:rPrDefault>
     <w:pPrDefault>
       <w:pPr>
-        <w:spacing w:after="160" w:line="259" w:lineRule="auto"/>
+        <w:spacing w:after="160" w:line="240" w:lineRule="auto"/>
       </w:pPr>
     </w:pPrDefault>
   </w:docDefaults>

</xml_diff>